<commit_message>
Cover division everywhere: checks, results and all documents
- --exhaustive now includes DIV: 7,140 trees, 294 divide-by-zero trees
  skipped, 13,692 runs, 0 failures; --suite adds (a + b) / c (11/11);
  --bench random trees include DIV
- results/ regenerated; README numbers and rule tables updated
- Review 3 report, slides (+ PDF), presenter notes and code guide
  updated for DIV: rule counts 11/17, 33/33 tests, new cost and
  benchmark figures, new line numbers, '%' as the unsupported-operator
  example, division-by-zero handling, defect D7

Co-Authored-By: Claude Opus 5.5 <noreply@anthropic.com>
</commit_message>
<xml_diff>
--- a/docs/Review3_Document.docx
+++ b/docs/Review3_Document.docx
@@ -1248,7 +1248,7 @@
               <w:jc w:val="left"/>
             </w:pPr>
             <w:r>
-              <w:t xml:space="preserve">Defined a 14-rule zero-address stack ISA with memory (</w:t>
+              <w:t xml:space="preserve">Defined a zero-address stack ISA (now 17 rules) with memory (</w:t>
             </w:r>
             <w:r>
               <w:rPr>
@@ -1450,7 +1450,7 @@
               <w:jc w:val="left"/>
             </w:pPr>
             <w:r>
-              <w:t xml:space="preserve">All six review expressions and four extra expressions run on both targets</w:t>
+              <w:t xml:space="preserve">All six review expressions plus five extra (incl. division) run on both targets</w:t>
             </w:r>
           </w:p>
         </w:tc>
@@ -1533,7 +1533,7 @@
               <w:jc w:val="left"/>
             </w:pPr>
             <w:r>
-              <w:t xml:space="preserve">25 stored regression cases + 10-expression suite + 3,333-tree exhaustive check</w:t>
+              <w:t xml:space="preserve">31 stored regression cases + 11-expression suite + 7,140-tree exhaustive check</w:t>
             </w:r>
           </w:p>
         </w:tc>
@@ -1994,10 +1994,10 @@
         <w:tblLook w:firstRow="1" w:lastRow="0" w:firstColumn="0" w:lastColumn="0" w:noHBand="0" w:noVBand="0" w:val="0020"/>
       </w:tblPr>
       <w:tblGrid>
-        <w:gridCol w:w="1131"/>
-        <w:gridCol w:w="1357"/>
-        <w:gridCol w:w="2489"/>
-        <w:gridCol w:w="2941"/>
+        <w:gridCol w:w="1142"/>
+        <w:gridCol w:w="1370"/>
+        <w:gridCol w:w="2513"/>
+        <w:gridCol w:w="2893"/>
       </w:tblGrid>
       <w:tr>
         <w:trPr>
@@ -2200,7 +2200,7 @@
               <w:jc w:val="left"/>
             </w:pPr>
             <w:r>
-              <w:t xml:space="preserve">14-rule stack machine with memory and immediate operands</w:t>
+              <w:t xml:space="preserve">17-rule stack machine with memory and immediate operands</w:t>
             </w:r>
           </w:p>
         </w:tc>
@@ -2313,6 +2313,56 @@
             </w:pPr>
             <w:r>
               <w:t xml:space="preserve">Required by the Review 3 guidelines (comparison / performance evidence).</w:t>
+            </w:r>
+          </w:p>
+        </w:tc>
+      </w:tr>
+      <w:tr>
+        <w:tc>
+          <w:tcPr/>
+          <w:p>
+            <w:pPr>
+              <w:pStyle w:val="Compact"/>
+              <w:jc w:val="left"/>
+            </w:pPr>
+            <w:r>
+              <w:t xml:space="preserve">IR operators</w:t>
+            </w:r>
+          </w:p>
+        </w:tc>
+        <w:tc>
+          <w:tcPr/>
+          <w:p>
+            <w:pPr>
+              <w:pStyle w:val="Compact"/>
+              <w:jc w:val="left"/>
+            </w:pPr>
+            <w:r>
+              <w:t xml:space="preserve">CONST, VAR, ADD, SUB, MUL, LOAD</w:t>
+            </w:r>
+          </w:p>
+        </w:tc>
+        <w:tc>
+          <w:tcPr/>
+          <w:p>
+            <w:pPr>
+              <w:pStyle w:val="Compact"/>
+              <w:jc w:val="left"/>
+            </w:pPr>
+            <w:r>
+              <w:t xml:space="preserve">Same six plus DIV (with DIVI / DIVM operand forms on the targets)</w:t>
+            </w:r>
+          </w:p>
+        </w:tc>
+        <w:tc>
+          <w:tcPr/>
+          <w:p>
+            <w:pPr>
+              <w:pStyle w:val="Compact"/>
+              <w:jc w:val="left"/>
+            </w:pPr>
+            <w:r>
+              <w:t xml:space="preserve">Division is a natural extension requested during preparation; it exercises the retargeting claim: one IR change, one rule group per grammar, no engine change.</w:t>
             </w:r>
           </w:p>
         </w:tc>
@@ -2323,7 +2373,7 @@
         <w:pStyle w:val="FirstParagraph"/>
       </w:pPr>
       <w:r>
-        <w:t xml:space="preserve">Scope is unchanged: expression-tree IR with CONST, VAR, ADD, SUB, MUL and LOAD; bottom-up matching with rule costs; two target ISAs; console harness.</w:t>
+        <w:t xml:space="preserve">Scope is unchanged apart from one extension: the expression-tree IR now has CONST, VAR, ADD, SUB, MUL, DIV and LOAD; bottom-up matching with rule costs; two target ISAs; console harness.</w:t>
       </w:r>
     </w:p>
     <w:p>
@@ -2341,7 +2391,7 @@
         <w:pStyle w:val="FirstParagraph"/>
       </w:pPr>
       <w:r>
-        <w:t xml:space="preserve">Instruction selection is the compiler back-end phase that maps machine-independent intermediate representation (IR) to the instructions of a particular processor. Hand-written selectors are hard to keep optimal and hard to move to a new processor. This project implements a compact, educational Bottom-Up Rewrite System (BURS) instruction selector that is retargetable by construction. An infix expression is parsed into an expression-tree IR with six node types (CONST, VAR, ADD, SUB, MUL, LOAD). Each target machine is described by one tree grammar whose rules pair an IR pattern with a cost and an instruction template. The BURG code-generator generator compiles each grammar into a table-driven matcher; a common, machine-independent engine labels the tree bottom-up so that every node knows its cheapest rule for every nonterminal, backtracks the minimum-cost cover from the root, and drives the target’s emitter in postorder. Two targets share the same IR and engine: Target A, a three-address load/store register machine (9 rules), and Target B, a zero-address stack machine with memory and immediate operand forms (14 rules). Every generated program is executed by a simulator for its ISA and compared with the IR’s own evaluation. All 25 regression cases, a 10-expression review suite and an exhaustive check of 3,333 trees (6,666 target runs) pass with zero failures. Against a naive one-instruction-per-node selector under the same cost model, BURS lowers the average cover cost by 5.2% on Target A and 23.6% on Target B. Labeling runs in linear time, about 10–20 ns per node for trees of up to 240,000 nodes. The result is a reproducible demonstration that one matching engine can produce different, verified, cost-optimal code for two instruction sets by changing only the target description.</w:t>
+        <w:t xml:space="preserve">Instruction selection is the compiler back-end phase that maps machine-independent intermediate representation (IR) to the instructions of a particular processor. Hand-written selectors are hard to keep optimal and hard to move to a new processor. This project implements a compact, educational Bottom-Up Rewrite System (BURS) instruction selector that is retargetable by construction. An infix expression is parsed into an expression-tree IR with seven node types (CONST, VAR, ADD, SUB, MUL, DIV, LOAD). Each target machine is described by one tree grammar whose rules pair an IR pattern with a cost and an instruction template. The BURG code-generator generator compiles each grammar into a table-driven matcher; a common, machine-independent engine labels the tree bottom-up so that every node knows its cheapest rule for every nonterminal, backtracks the minimum-cost cover from the root, and drives the target’s emitter in postorder. Two targets share the same IR and engine: Target A, a three-address load/store register machine (11 rules), and Target B, a zero-address stack machine with memory and immediate operand forms (17 rules). Every generated program is executed by a simulator for its ISA and compared with the IR’s own evaluation. All 31 regression cases, an 11-expression review suite and an exhaustive check of 7,140 trees (13,692 target runs) pass with zero failures. Against a naive one-instruction-per-node selector under the same cost model, BURS lowers the average cover cost by 5.1% on Target A and 20.9% on Target B. Labeling runs in linear time, about 9–21 ns per node for trees of up to 240,000 nodes. The result is a reproducible demonstration that one matching engine can produce different, verified, cost-optimal code for two instruction sets by changing only the target description.</w:t>
       </w:r>
     </w:p>
     <w:p>
@@ -2643,7 +2693,7 @@
               <w:jc w:val="left"/>
             </w:pPr>
             <w:r>
-              <w:t xml:space="preserve">All six node types built and printed; parser for infix input</w:t>
+              <w:t xml:space="preserve">All node types (six + DIV) built and printed; infix parser</w:t>
             </w:r>
           </w:p>
         </w:tc>
@@ -2756,7 +2806,7 @@
               <w:t xml:space="preserve"> </w:t>
             </w:r>
             <w:r>
-              <w:t xml:space="preserve">(9 rules),</w:t>
+              <w:t xml:space="preserve">(11 rules),</w:t>
             </w:r>
             <w:r>
               <w:t xml:space="preserve"> </w:t>
@@ -2771,7 +2821,7 @@
               <w:t xml:space="preserve"> </w:t>
             </w:r>
             <w:r>
-              <w:t xml:space="preserve">(14 rules); App. C</w:t>
+              <w:t xml:space="preserve">(17 rules); App. C</w:t>
             </w:r>
           </w:p>
         </w:tc>
@@ -3123,7 +3173,7 @@
               <w:t xml:space="preserve"> </w:t>
             </w:r>
             <w:r>
-              <w:t xml:space="preserve">(27 passed, 0 failed);</w:t>
+              <w:t xml:space="preserve">(33 passed, 0 failed);</w:t>
             </w:r>
             <w:r>
               <w:t xml:space="preserve"> </w:t>
@@ -3153,7 +3203,7 @@
         <w:pStyle w:val="FirstParagraph"/>
       </w:pPr>
       <w:r>
-        <w:t xml:space="preserve">Expression-tree IR (CONST, VAR, ADD, SUB, MUL, LOAD); infix parser with</w:t>
+        <w:t xml:space="preserve">Expression-tree IR (CONST, VAR, ADD, SUB, MUL, DIV, LOAD); infix parser with</w:t>
       </w:r>
       <w:r>
         <w:t xml:space="preserve"> </w:t>
@@ -3201,7 +3251,7 @@
         <w:pStyle w:val="FirstParagraph"/>
       </w:pPr>
       <w:r>
-        <w:t xml:space="preserve">Expression trees only (no statements, control flow or DAG sharing); unlimited virtual registers on Target A (no register allocation or spilling); integer arithmetic only, without division or unary minus; costs are static per rule (no dynamic costs); educational ISAs, not a production processor.</w:t>
+        <w:t xml:space="preserve">Expression trees only (no statements, control flow or DAG sharing); unlimited virtual registers on Target A (no register allocation or spilling); integer arithmetic only (division truncates toward zero; division by zero has no value), without unary minus or remainder; costs are static per rule (no dynamic costs); educational ISAs, not a production processor.</w:t>
       </w:r>
     </w:p>
     <w:p>
@@ -4243,7 +4293,7 @@
               <w:t xml:space="preserve"> </w:t>
             </w:r>
             <w:r>
-              <w:t xml:space="preserve">(25 cases), built-in suite (10 expressions), exhaustive generator (3,333 trees), benchmark trees</w:t>
+              <w:t xml:space="preserve">(31 cases), built-in suite (11 expressions), exhaustive generator (7,140 trees), benchmark trees</w:t>
             </w:r>
           </w:p>
         </w:tc>
@@ -5321,7 +5371,7 @@
         <w:rPr>
           <w:rStyle w:val="VerbatimChar"/>
         </w:rPr>
-        <w:t xml:space="preserve">    int op;                      /* CONST=1 VAR=2 ADD=3 SUB=4 MUL=5 LOAD=6          */</w:t>
+        <w:t xml:space="preserve">    int op;                      /* CONST=1 VAR=2 ADD=3 SUB=4 MUL=5 LOAD=6 DIV=7   */</w:t>
       </w:r>
       <w:r>
         <w:br/>
@@ -5507,9 +5557,9 @@
         <w:tblLook w:firstRow="1" w:lastRow="0" w:firstColumn="0" w:lastColumn="0" w:noHBand="0" w:noVBand="0" w:val="0020"/>
       </w:tblPr>
       <w:tblGrid>
-        <w:gridCol w:w="1614"/>
-        <w:gridCol w:w="2998"/>
-        <w:gridCol w:w="3306"/>
+        <w:gridCol w:w="1475"/>
+        <w:gridCol w:w="3028"/>
+        <w:gridCol w:w="3416"/>
       </w:tblGrid>
       <w:tr>
         <w:trPr>
@@ -5697,19 +5747,19 @@
               <w:jc w:val="left"/>
             </w:pPr>
             <w:r>
-              <w:t xml:space="preserve">9</w:t>
-            </w:r>
-          </w:p>
-        </w:tc>
-        <w:tc>
-          <w:tcPr/>
-          <w:p>
-            <w:pPr>
-              <w:pStyle w:val="Compact"/>
-              <w:jc w:val="left"/>
-            </w:pPr>
-            <w:r>
-              <w:t xml:space="preserve">14</w:t>
+              <w:t xml:space="preserve">11</w:t>
+            </w:r>
+          </w:p>
+        </w:tc>
+        <w:tc>
+          <w:tcPr/>
+          <w:p>
+            <w:pPr>
+              <w:pStyle w:val="Compact"/>
+              <w:jc w:val="left"/>
+            </w:pPr>
+            <w:r>
+              <w:t xml:space="preserve">17</w:t>
             </w:r>
           </w:p>
         </w:tc>
@@ -5824,6 +5874,30 @@
               </w:rPr>
               <w:t xml:space="preserve">MUL</w:t>
             </w:r>
+            <w:r>
+              <w:t xml:space="preserve">,</w:t>
+            </w:r>
+            <w:r>
+              <w:t xml:space="preserve"> </w:t>
+            </w:r>
+            <w:r>
+              <w:rPr>
+                <w:rStyle w:val="VerbatimChar"/>
+              </w:rPr>
+              <w:t xml:space="preserve">DIV</w:t>
+            </w:r>
+            <w:r>
+              <w:t xml:space="preserve">,</w:t>
+            </w:r>
+            <w:r>
+              <w:t xml:space="preserve"> </w:t>
+            </w:r>
+            <w:r>
+              <w:rPr>
+                <w:rStyle w:val="VerbatimChar"/>
+              </w:rPr>
+              <w:t xml:space="preserve">DIVI</w:t>
+            </w:r>
           </w:p>
         </w:tc>
         <w:tc>
@@ -5873,7 +5947,7 @@
               <w:rPr>
                 <w:rStyle w:val="VerbatimChar"/>
               </w:rPr>
-              <w:t xml:space="preserve">ADD/SUB/MUL</w:t>
+              <w:t xml:space="preserve">ADD/SUB/MUL/DIV</w:t>
             </w:r>
             <w:r>
               <w:t xml:space="preserve">,</w:t>
@@ -5885,7 +5959,7 @@
               <w:rPr>
                 <w:rStyle w:val="VerbatimChar"/>
               </w:rPr>
-              <w:t xml:space="preserve">ADDM/SUBM/MULM [var]</w:t>
+              <w:t xml:space="preserve">ADDM/SUBM/MULM/DIVM [var]</w:t>
             </w:r>
             <w:r>
               <w:t xml:space="preserve">,</w:t>
@@ -5897,7 +5971,7 @@
               <w:rPr>
                 <w:rStyle w:val="VerbatimChar"/>
               </w:rPr>
-              <w:t xml:space="preserve">ADDI/SUBI/MULI #k</w:t>
+              <w:t xml:space="preserve">ADDI/SUBI/MULI/DIVI #k</w:t>
             </w:r>
           </w:p>
         </w:tc>
@@ -5923,19 +5997,19 @@
               <w:jc w:val="left"/>
             </w:pPr>
             <w:r>
-              <w:t xml:space="preserve">immediate on the right of ADD/SUB</w:t>
-            </w:r>
-          </w:p>
-        </w:tc>
-        <w:tc>
-          <w:tcPr/>
-          <w:p>
-            <w:pPr>
-              <w:pStyle w:val="Compact"/>
-              <w:jc w:val="left"/>
-            </w:pPr>
-            <w:r>
-              <w:t xml:space="preserve">memory or immediate on the right of ADD/SUB/MUL</w:t>
+              <w:t xml:space="preserve">immediate on the right of ADD/SUB/DIV</w:t>
+            </w:r>
+          </w:p>
+        </w:tc>
+        <w:tc>
+          <w:tcPr/>
+          <w:p>
+            <w:pPr>
+              <w:pStyle w:val="Compact"/>
+              <w:jc w:val="left"/>
+            </w:pPr>
+            <w:r>
+              <w:t xml:space="preserve">memory or immediate on the right of ADD/SUB/MUL/DIV</w:t>
             </w:r>
           </w:p>
         </w:tc>
@@ -5961,19 +6035,19 @@
               <w:jc w:val="left"/>
             </w:pPr>
             <w:r>
-              <w:t xml:space="preserve">1 per instruction, MUL = 2</w:t>
-            </w:r>
-          </w:p>
-        </w:tc>
-        <w:tc>
-          <w:tcPr/>
-          <w:p>
-            <w:pPr>
-              <w:pStyle w:val="Compact"/>
-              <w:jc w:val="left"/>
-            </w:pPr>
-            <w:r>
-              <w:t xml:space="preserve">1 per instruction, MUL forms = 2</w:t>
+              <w:t xml:space="preserve">1 per instruction, MUL = 2, DIV = 3</w:t>
+            </w:r>
+          </w:p>
+        </w:tc>
+        <w:tc>
+          <w:tcPr/>
+          <w:p>
+            <w:pPr>
+              <w:pStyle w:val="Compact"/>
+              <w:jc w:val="left"/>
+            </w:pPr>
+            <w:r>
+              <w:t xml:space="preserve">1 per instruction, MUL forms = 2, DIV forms = 3</w:t>
             </w:r>
           </w:p>
         </w:tc>
@@ -5999,19 +6073,19 @@
               <w:jc w:val="left"/>
             </w:pPr>
             <w:r>
-              <w:t xml:space="preserve">9</w:t>
-            </w:r>
-          </w:p>
-        </w:tc>
-        <w:tc>
-          <w:tcPr/>
-          <w:p>
-            <w:pPr>
-              <w:pStyle w:val="Compact"/>
-              <w:jc w:val="left"/>
-            </w:pPr>
-            <w:r>
-              <w:t xml:space="preserve">13</w:t>
+              <w:t xml:space="preserve">11</w:t>
+            </w:r>
+          </w:p>
+        </w:tc>
+        <w:tc>
+          <w:tcPr/>
+          <w:p>
+            <w:pPr>
+              <w:pStyle w:val="Compact"/>
+              <w:jc w:val="left"/>
+            </w:pPr>
+            <w:r>
+              <w:t xml:space="preserve">16</w:t>
             </w:r>
           </w:p>
         </w:tc>
@@ -6460,7 +6534,7 @@
         <w:rPr>
           <w:rStyle w:val="VerbatimChar"/>
         </w:rPr>
-        <w:t xml:space="preserve">term := primary ('*' primary)*</w:t>
+        <w:t xml:space="preserve">term := primary (('*'|'/') primary)*</w:t>
       </w:r>
       <w:r>
         <w:t xml:space="preserve">,</w:t>
@@ -6485,6 +6559,21 @@
           <w:rStyle w:val="VerbatimChar"/>
         </w:rPr>
         <w:t xml:space="preserve">*</w:t>
+      </w:r>
+      <w:r>
+        <w:t xml:space="preserve"> </w:t>
+      </w:r>
+      <w:r>
+        <w:t xml:space="preserve">and</w:t>
+      </w:r>
+      <w:r>
+        <w:t xml:space="preserve"> </w:t>
+      </w:r>
+      <w:r>
+        <w:rPr>
+          <w:rStyle w:val="VerbatimChar"/>
+        </w:rPr>
+        <w:t xml:space="preserve">/</w:t>
       </w:r>
       <w:r>
         <w:t xml:space="preserve"> </w:t>
@@ -6659,7 +6748,7 @@
         <w:t xml:space="preserve">O(n) time, O(n) space</w:t>
       </w:r>
       <w:r>
-        <w:t xml:space="preserve">. The grammar here has only 9 (A) and 13 (B) state rows, so the tables are a few hundred bytes.</w:t>
+        <w:t xml:space="preserve">. The grammars here have only 11 (A) and 16 (B) state rows, so the tables are a few hundred bytes.</w:t>
       </w:r>
     </w:p>
     <w:p>
@@ -7809,7 +7898,7 @@
               <w:jc w:val="right"/>
             </w:pPr>
             <w:r>
-              <w:t xml:space="preserve">484</w:t>
+              <w:t xml:space="preserve">507</w:t>
             </w:r>
           </w:p>
         </w:tc>
@@ -7915,19 +8004,19 @@
               <w:jc w:val="right"/>
             </w:pPr>
             <w:r>
-              <w:t xml:space="preserve">184</w:t>
-            </w:r>
-          </w:p>
-        </w:tc>
-        <w:tc>
-          <w:tcPr/>
-          <w:p>
-            <w:pPr>
-              <w:pStyle w:val="Compact"/>
-              <w:jc w:val="left"/>
-            </w:pPr>
-            <w:r>
-              <w:t xml:space="preserve">9 rules, rule table,</w:t>
+              <w:t xml:space="preserve">194</w:t>
+            </w:r>
+          </w:p>
+        </w:tc>
+        <w:tc>
+          <w:tcPr/>
+          <w:p>
+            <w:pPr>
+              <w:pStyle w:val="Compact"/>
+              <w:jc w:val="left"/>
+            </w:pPr>
+            <w:r>
+              <w:t xml:space="preserve">11 rules, rule table,</w:t>
             </w:r>
             <w:r>
               <w:t xml:space="preserve"> </w:t>
@@ -7989,19 +8078,19 @@
               <w:jc w:val="right"/>
             </w:pPr>
             <w:r>
-              <w:t xml:space="preserve">192</w:t>
-            </w:r>
-          </w:p>
-        </w:tc>
-        <w:tc>
-          <w:tcPr/>
-          <w:p>
-            <w:pPr>
-              <w:pStyle w:val="Compact"/>
-              <w:jc w:val="left"/>
-            </w:pPr>
-            <w:r>
-              <w:t xml:space="preserve">14 rules, rule table,</w:t>
+              <w:t xml:space="preserve">208</w:t>
+            </w:r>
+          </w:p>
+        </w:tc>
+        <w:tc>
+          <w:tcPr/>
+          <w:p>
+            <w:pPr>
+              <w:pStyle w:val="Compact"/>
+              <w:jc w:val="left"/>
+            </w:pPr>
+            <w:r>
+              <w:t xml:space="preserve">17 rules, rule table,</w:t>
             </w:r>
             <w:r>
               <w:t xml:space="preserve"> </w:t>
@@ -8063,7 +8152,7 @@
               <w:jc w:val="right"/>
             </w:pPr>
             <w:r>
-              <w:t xml:space="preserve">545</w:t>
+              <w:t xml:space="preserve">575</w:t>
             </w:r>
           </w:p>
         </w:tc>
@@ -8176,19 +8265,19 @@
               <w:jc w:val="right"/>
             </w:pPr>
             <w:r>
-              <w:t xml:space="preserve">186</w:t>
-            </w:r>
-          </w:p>
-        </w:tc>
-        <w:tc>
-          <w:tcPr/>
-          <w:p>
-            <w:pPr>
-              <w:pStyle w:val="Compact"/>
-              <w:jc w:val="left"/>
-            </w:pPr>
-            <w:r>
-              <w:t xml:space="preserve">Regression runner, results generator, 25 cases with expected outputs; three-stage build</w:t>
+              <w:t xml:space="preserve">194</w:t>
+            </w:r>
+          </w:p>
+        </w:tc>
+        <w:tc>
+          <w:tcPr/>
+          <w:p>
+            <w:pPr>
+              <w:pStyle w:val="Compact"/>
+              <w:jc w:val="left"/>
+            </w:pPr>
+            <w:r>
+              <w:t xml:space="preserve">Regression runner, results generator, 31 cases with expected outputs; three-stage build</w:t>
             </w:r>
           </w:p>
         </w:tc>
@@ -8367,7 +8456,7 @@
         <w:rPr>
           <w:rStyle w:val="VerbatimChar"/>
         </w:rPr>
-        <w:t xml:space="preserve">CONST=1 VAR=2 ADD=3 SUB=4 MUL=5 LOAD=6</w:t>
+        <w:t xml:space="preserve">CONST=1 VAR=2 ADD=3 SUB=4 MUL=5 LOAD=6 DIV=7</w:t>
       </w:r>
       <w:r>
         <w:t xml:space="preserve"> </w:t>
@@ -8536,7 +8625,7 @@
           <w:b/>
           <w:bCs/>
         </w:rPr>
-        <w:t xml:space="preserve">27 passed, 0 failed</w:t>
+        <w:t xml:space="preserve">33 passed, 0 failed</w:t>
       </w:r>
       <w:r>
         <w:t xml:space="preserve"> </w:t>
@@ -8662,7 +8751,22 @@
         <w:t xml:space="preserve"> </w:t>
       </w:r>
       <w:r>
-        <w:t xml:space="preserve">negative.</w:t>
+        <w:t xml:space="preserve">negative (exit 2),</w:t>
+      </w:r>
+      <w:r>
+        <w:t xml:space="preserve"> </w:t>
+      </w:r>
+      <w:r>
+        <w:rPr>
+          <w:rStyle w:val="VerbatimChar"/>
+        </w:rPr>
+        <w:t xml:space="preserve">fail</w:t>
+      </w:r>
+      <w:r>
+        <w:t xml:space="preserve"> </w:t>
+      </w:r>
+      <w:r>
+        <w:t xml:space="preserve">valid input whose value is undefined (exit 3).</w:t>
       </w:r>
     </w:p>
     <w:tbl>
@@ -9389,6 +9493,232 @@
               <w:rPr>
                 <w:rStyle w:val="VerbatimChar"/>
               </w:rPr>
+              <w:t xml:space="preserve">pos_division</w:t>
+            </w:r>
+          </w:p>
+        </w:tc>
+        <w:tc>
+          <w:tcPr/>
+          <w:p>
+            <w:pPr>
+              <w:pStyle w:val="Compact"/>
+              <w:jc w:val="left"/>
+            </w:pPr>
+            <w:r>
+              <w:rPr>
+                <w:rStyle w:val="VerbatimChar"/>
+              </w:rPr>
+              <w:t xml:space="preserve">(a + b) / c</w:t>
+            </w:r>
+          </w:p>
+        </w:tc>
+        <w:tc>
+          <w:tcPr/>
+          <w:p>
+            <w:pPr>
+              <w:pStyle w:val="Compact"/>
+              <w:jc w:val="left"/>
+            </w:pPr>
+            <w:r>
+              <w:t xml:space="preserve">Valid tree, min-cost cover, code for both targets; value 1</w:t>
+            </w:r>
+          </w:p>
+        </w:tc>
+        <w:tc>
+          <w:tcPr/>
+          <w:p>
+            <w:pPr>
+              <w:pStyle w:val="Compact"/>
+              <w:jc w:val="left"/>
+            </w:pPr>
+            <w:r>
+              <w:t xml:space="preserve">A:</w:t>
+            </w:r>
+            <w:r>
+              <w:t xml:space="preserve"> </w:t>
+            </w:r>
+            <w:r>
+              <w:rPr>
+                <w:rStyle w:val="VerbatimChar"/>
+              </w:rPr>
+              <w:t xml:space="preserve">LOAD r0,[a]; LOAD r1,[b]; ADD r2,r0,r1; LOAD r3,[c]; DIV r4,r2,r3</w:t>
+            </w:r>
+            <w:r>
+              <w:t xml:space="preserve"> </w:t>
+            </w:r>
+            <w:r>
+              <w:t xml:space="preserve">(cost 7) OK ; B:</w:t>
+            </w:r>
+            <w:r>
+              <w:t xml:space="preserve"> </w:t>
+            </w:r>
+            <w:r>
+              <w:rPr>
+                <w:rStyle w:val="VerbatimChar"/>
+              </w:rPr>
+              <w:t xml:space="preserve">PUSH [a]; ADDM [b]; DIVM [c]</w:t>
+            </w:r>
+            <w:r>
+              <w:t xml:space="preserve"> </w:t>
+            </w:r>
+            <w:r>
+              <w:t xml:space="preserve">(cost 5) OK</w:t>
+            </w:r>
+          </w:p>
+        </w:tc>
+        <w:tc>
+          <w:tcPr/>
+          <w:p>
+            <w:pPr>
+              <w:pStyle w:val="Compact"/>
+              <w:jc w:val="center"/>
+            </w:pPr>
+            <w:r>
+              <w:t xml:space="preserve">PASS</w:t>
+            </w:r>
+          </w:p>
+        </w:tc>
+      </w:tr>
+      <w:tr>
+        <w:tc>
+          <w:tcPr/>
+          <w:p>
+            <w:pPr>
+              <w:pStyle w:val="Compact"/>
+              <w:jc w:val="left"/>
+            </w:pPr>
+            <w:r>
+              <w:rPr>
+                <w:rStyle w:val="VerbatimChar"/>
+              </w:rPr>
+              <w:t xml:space="preserve">pos_division_mixed</w:t>
+            </w:r>
+          </w:p>
+        </w:tc>
+        <w:tc>
+          <w:tcPr/>
+          <w:p>
+            <w:pPr>
+              <w:pStyle w:val="Compact"/>
+              <w:jc w:val="left"/>
+            </w:pPr>
+            <w:r>
+              <w:rPr>
+                <w:rStyle w:val="VerbatimChar"/>
+              </w:rPr>
+              <w:t xml:space="preserve">((a*b)+((a-c)*d/b)+a*2)</w:t>
+            </w:r>
+          </w:p>
+        </w:tc>
+        <w:tc>
+          <w:tcPr/>
+          <w:p>
+            <w:pPr>
+              <w:pStyle w:val="Compact"/>
+              <w:jc w:val="left"/>
+            </w:pPr>
+            <w:r>
+              <w:t xml:space="preserve">Valid tree, min-cost cover, code for both targets; value 7</w:t>
+            </w:r>
+          </w:p>
+        </w:tc>
+        <w:tc>
+          <w:tcPr/>
+          <w:p>
+            <w:pPr>
+              <w:pStyle w:val="Compact"/>
+              <w:jc w:val="left"/>
+            </w:pPr>
+            <w:r>
+              <w:t xml:space="preserve">A: 15 instructions:</w:t>
+            </w:r>
+            <w:r>
+              <w:t xml:space="preserve"> </w:t>
+            </w:r>
+            <w:r>
+              <w:rPr>
+                <w:rStyle w:val="VerbatimChar"/>
+              </w:rPr>
+              <w:t xml:space="preserve">LOAD r0,[a]; LOAD r1,[b]</w:t>
+            </w:r>
+            <w:r>
+              <w:t xml:space="preserve"> </w:t>
+            </w:r>
+            <w:r>
+              <w:t xml:space="preserve">…</w:t>
+            </w:r>
+            <w:r>
+              <w:t xml:space="preserve"> </w:t>
+            </w:r>
+            <w:r>
+              <w:rPr>
+                <w:rStyle w:val="VerbatimChar"/>
+              </w:rPr>
+              <w:t xml:space="preserve">ADD r14,r10,r13</w:t>
+            </w:r>
+            <w:r>
+              <w:t xml:space="preserve"> </w:t>
+            </w:r>
+            <w:r>
+              <w:t xml:space="preserve">(cost 20) OK ; B: 10 instructions:</w:t>
+            </w:r>
+            <w:r>
+              <w:t xml:space="preserve"> </w:t>
+            </w:r>
+            <w:r>
+              <w:rPr>
+                <w:rStyle w:val="VerbatimChar"/>
+              </w:rPr>
+              <w:t xml:space="preserve">PUSH [a]; MULM [b]</w:t>
+            </w:r>
+            <w:r>
+              <w:t xml:space="preserve"> </w:t>
+            </w:r>
+            <w:r>
+              <w:t xml:space="preserve">…</w:t>
+            </w:r>
+            <w:r>
+              <w:t xml:space="preserve"> </w:t>
+            </w:r>
+            <w:r>
+              <w:rPr>
+                <w:rStyle w:val="VerbatimChar"/>
+              </w:rPr>
+              <w:t xml:space="preserve">ADD</w:t>
+            </w:r>
+            <w:r>
+              <w:t xml:space="preserve"> </w:t>
+            </w:r>
+            <w:r>
+              <w:t xml:space="preserve">(cost 15) OK</w:t>
+            </w:r>
+          </w:p>
+        </w:tc>
+        <w:tc>
+          <w:tcPr/>
+          <w:p>
+            <w:pPr>
+              <w:pStyle w:val="Compact"/>
+              <w:jc w:val="center"/>
+            </w:pPr>
+            <w:r>
+              <w:t xml:space="preserve">PASS</w:t>
+            </w:r>
+          </w:p>
+        </w:tc>
+      </w:tr>
+      <w:tr>
+        <w:tc>
+          <w:tcPr/>
+          <w:p>
+            <w:pPr>
+              <w:pStyle w:val="Compact"/>
+              <w:jc w:val="left"/>
+            </w:pPr>
+            <w:r>
+              <w:rPr>
+                <w:rStyle w:val="VerbatimChar"/>
+              </w:rPr>
               <w:t xml:space="preserve">bnd_single_var</w:t>
             </w:r>
           </w:p>
@@ -10022,6 +10352,104 @@
               <w:rPr>
                 <w:rStyle w:val="VerbatimChar"/>
               </w:rPr>
+              <w:t xml:space="preserve">bnd_div_truncates</w:t>
+            </w:r>
+          </w:p>
+        </w:tc>
+        <w:tc>
+          <w:tcPr/>
+          <w:p>
+            <w:pPr>
+              <w:pStyle w:val="Compact"/>
+              <w:jc w:val="left"/>
+            </w:pPr>
+            <w:r>
+              <w:rPr>
+                <w:rStyle w:val="VerbatimChar"/>
+              </w:rPr>
+              <w:t xml:space="preserve">(0 - 7) / 2</w:t>
+            </w:r>
+          </w:p>
+        </w:tc>
+        <w:tc>
+          <w:tcPr/>
+          <w:p>
+            <w:pPr>
+              <w:pStyle w:val="Compact"/>
+              <w:jc w:val="left"/>
+            </w:pPr>
+            <w:r>
+              <w:t xml:space="preserve">Negative quotient truncates toward zero; value -3</w:t>
+            </w:r>
+          </w:p>
+        </w:tc>
+        <w:tc>
+          <w:tcPr/>
+          <w:p>
+            <w:pPr>
+              <w:pStyle w:val="Compact"/>
+              <w:jc w:val="left"/>
+            </w:pPr>
+            <w:r>
+              <w:t xml:space="preserve">A:</w:t>
+            </w:r>
+            <w:r>
+              <w:t xml:space="preserve"> </w:t>
+            </w:r>
+            <w:r>
+              <w:rPr>
+                <w:rStyle w:val="VerbatimChar"/>
+              </w:rPr>
+              <w:t xml:space="preserve">LOADI r0,#0; SUBI r1,r0,#7; DIVI r2,r1,#2</w:t>
+            </w:r>
+            <w:r>
+              <w:t xml:space="preserve"> </w:t>
+            </w:r>
+            <w:r>
+              <w:t xml:space="preserve">(cost 5) OK ; B:</w:t>
+            </w:r>
+            <w:r>
+              <w:t xml:space="preserve"> </w:t>
+            </w:r>
+            <w:r>
+              <w:rPr>
+                <w:rStyle w:val="VerbatimChar"/>
+              </w:rPr>
+              <w:t xml:space="preserve">PUSHI #0; SUBI #7; DIVI #2</w:t>
+            </w:r>
+            <w:r>
+              <w:t xml:space="preserve"> </w:t>
+            </w:r>
+            <w:r>
+              <w:t xml:space="preserve">(cost 5) OK</w:t>
+            </w:r>
+          </w:p>
+        </w:tc>
+        <w:tc>
+          <w:tcPr/>
+          <w:p>
+            <w:pPr>
+              <w:pStyle w:val="Compact"/>
+              <w:jc w:val="center"/>
+            </w:pPr>
+            <w:r>
+              <w:t xml:space="preserve">PASS</w:t>
+            </w:r>
+          </w:p>
+        </w:tc>
+      </w:tr>
+      <w:tr>
+        <w:tc>
+          <w:tcPr/>
+          <w:p>
+            <w:pPr>
+              <w:pStyle w:val="Compact"/>
+              <w:jc w:val="left"/>
+            </w:pPr>
+            <w:r>
+              <w:rPr>
+                <w:rStyle w:val="VerbatimChar"/>
+              </w:rPr>
               <w:t xml:space="preserve">rule_addi_vs_loadi</w:t>
             </w:r>
           </w:p>
@@ -10512,7 +10940,105 @@
               <w:rPr>
                 <w:rStyle w:val="VerbatimChar"/>
               </w:rPr>
-              <w:t xml:space="preserve">neg_division</w:t>
+              <w:t xml:space="preserve">rule_divi</w:t>
+            </w:r>
+          </w:p>
+        </w:tc>
+        <w:tc>
+          <w:tcPr/>
+          <w:p>
+            <w:pPr>
+              <w:pStyle w:val="Compact"/>
+              <w:jc w:val="left"/>
+            </w:pPr>
+            <w:r>
+              <w:rPr>
+                <w:rStyle w:val="VerbatimChar"/>
+              </w:rPr>
+              <w:t xml:space="preserve">a / 2</w:t>
+            </w:r>
+            <w:r>
+              <w:t xml:space="preserve"> </w:t>
+            </w:r>
+            <w:r>
+              <w:t xml:space="preserve">(</w:t>
+            </w:r>
+            <w:r>
+              <w:rPr>
+                <w:rStyle w:val="VerbatimChar"/>
+              </w:rPr>
+              <w:t xml:space="preserve">-t A</w:t>
+            </w:r>
+            <w:r>
+              <w:t xml:space="preserve">)</w:t>
+            </w:r>
+          </w:p>
+        </w:tc>
+        <w:tc>
+          <w:tcPr/>
+          <w:p>
+            <w:pPr>
+              <w:pStyle w:val="Compact"/>
+              <w:jc w:val="left"/>
+            </w:pPr>
+            <w:r>
+              <w:t xml:space="preserve">DIVI chosen: cost 4, not LOADI + DIV (5)</w:t>
+            </w:r>
+          </w:p>
+        </w:tc>
+        <w:tc>
+          <w:tcPr/>
+          <w:p>
+            <w:pPr>
+              <w:pStyle w:val="Compact"/>
+              <w:jc w:val="left"/>
+            </w:pPr>
+            <w:r>
+              <w:t xml:space="preserve">A:</w:t>
+            </w:r>
+            <w:r>
+              <w:t xml:space="preserve"> </w:t>
+            </w:r>
+            <w:r>
+              <w:rPr>
+                <w:rStyle w:val="VerbatimChar"/>
+              </w:rPr>
+              <w:t xml:space="preserve">LOAD r0,[a]; DIVI r1,r0,#2</w:t>
+            </w:r>
+            <w:r>
+              <w:t xml:space="preserve"> </w:t>
+            </w:r>
+            <w:r>
+              <w:t xml:space="preserve">(cost 4) OK</w:t>
+            </w:r>
+          </w:p>
+        </w:tc>
+        <w:tc>
+          <w:tcPr/>
+          <w:p>
+            <w:pPr>
+              <w:pStyle w:val="Compact"/>
+              <w:jc w:val="center"/>
+            </w:pPr>
+            <w:r>
+              <w:t xml:space="preserve">PASS</w:t>
+            </w:r>
+          </w:p>
+        </w:tc>
+      </w:tr>
+      <w:tr>
+        <w:tc>
+          <w:tcPr/>
+          <w:p>
+            <w:pPr>
+              <w:pStyle w:val="Compact"/>
+              <w:jc w:val="left"/>
+            </w:pPr>
+            <w:r>
+              <w:rPr>
+                <w:rStyle w:val="VerbatimChar"/>
+              </w:rPr>
+              <w:t xml:space="preserve">rule_divm</w:t>
             </w:r>
           </w:p>
         </w:tc>
@@ -10529,6 +11055,104 @@
               </w:rPr>
               <w:t xml:space="preserve">a / b</w:t>
             </w:r>
+            <w:r>
+              <w:t xml:space="preserve"> </w:t>
+            </w:r>
+            <w:r>
+              <w:t xml:space="preserve">(</w:t>
+            </w:r>
+            <w:r>
+              <w:rPr>
+                <w:rStyle w:val="VerbatimChar"/>
+              </w:rPr>
+              <w:t xml:space="preserve">-t B</w:t>
+            </w:r>
+            <w:r>
+              <w:t xml:space="preserve">)</w:t>
+            </w:r>
+          </w:p>
+        </w:tc>
+        <w:tc>
+          <w:tcPr/>
+          <w:p>
+            <w:pPr>
+              <w:pStyle w:val="Compact"/>
+              <w:jc w:val="left"/>
+            </w:pPr>
+            <w:r>
+              <w:t xml:space="preserve">DIVM chosen: cost 4, not PUSH + PUSH + DIV (5)</w:t>
+            </w:r>
+          </w:p>
+        </w:tc>
+        <w:tc>
+          <w:tcPr/>
+          <w:p>
+            <w:pPr>
+              <w:pStyle w:val="Compact"/>
+              <w:jc w:val="left"/>
+            </w:pPr>
+            <w:r>
+              <w:t xml:space="preserve">B:</w:t>
+            </w:r>
+            <w:r>
+              <w:t xml:space="preserve"> </w:t>
+            </w:r>
+            <w:r>
+              <w:rPr>
+                <w:rStyle w:val="VerbatimChar"/>
+              </w:rPr>
+              <w:t xml:space="preserve">PUSH [a]; DIVM [b]</w:t>
+            </w:r>
+            <w:r>
+              <w:t xml:space="preserve"> </w:t>
+            </w:r>
+            <w:r>
+              <w:t xml:space="preserve">(cost 4) OK</w:t>
+            </w:r>
+          </w:p>
+        </w:tc>
+        <w:tc>
+          <w:tcPr/>
+          <w:p>
+            <w:pPr>
+              <w:pStyle w:val="Compact"/>
+              <w:jc w:val="center"/>
+            </w:pPr>
+            <w:r>
+              <w:t xml:space="preserve">PASS</w:t>
+            </w:r>
+          </w:p>
+        </w:tc>
+      </w:tr>
+      <w:tr>
+        <w:tc>
+          <w:tcPr/>
+          <w:p>
+            <w:pPr>
+              <w:pStyle w:val="Compact"/>
+              <w:jc w:val="left"/>
+            </w:pPr>
+            <w:r>
+              <w:rPr>
+                <w:rStyle w:val="VerbatimChar"/>
+              </w:rPr>
+              <w:t xml:space="preserve">neg_modulo</w:t>
+            </w:r>
+          </w:p>
+        </w:tc>
+        <w:tc>
+          <w:tcPr/>
+          <w:p>
+            <w:pPr>
+              <w:pStyle w:val="Compact"/>
+              <w:jc w:val="left"/>
+            </w:pPr>
+            <w:r>
+              <w:rPr>
+                <w:rStyle w:val="VerbatimChar"/>
+              </w:rPr>
+              <w:t xml:space="preserve">a % b</w:t>
+            </w:r>
           </w:p>
         </w:tc>
         <w:tc>
@@ -10557,13 +11181,13 @@
               <w:t xml:space="preserve"> </w:t>
             </w:r>
             <w:r>
-              <w:t xml:space="preserve">‘/’</w:t>
-            </w:r>
-            <w:r>
-              <w:t xml:space="preserve"> </w:t>
-            </w:r>
-            <w:r>
-              <w:t xml:space="preserve">is not supported (IR has ADD, SUB, MUL, LOAD only)</w:t>
+              <w:t xml:space="preserve">‘%’</w:t>
+            </w:r>
+            <w:r>
+              <w:t xml:space="preserve"> </w:t>
+            </w:r>
+            <w:r>
+              <w:t xml:space="preserve">is not supported (IR has ADD, SUB, MUL, DIV, LOAD only)</w:t>
             </w:r>
           </w:p>
         </w:tc>
@@ -11155,6 +11779,104 @@
               <w:rPr>
                 <w:rStyle w:val="VerbatimChar"/>
               </w:rPr>
+              <w:t xml:space="preserve">fail_div_by_zero</w:t>
+            </w:r>
+          </w:p>
+        </w:tc>
+        <w:tc>
+          <w:tcPr/>
+          <w:p>
+            <w:pPr>
+              <w:pStyle w:val="Compact"/>
+              <w:jc w:val="left"/>
+            </w:pPr>
+            <w:r>
+              <w:rPr>
+                <w:rStyle w:val="VerbatimChar"/>
+              </w:rPr>
+              <w:t xml:space="preserve">a / (b - b)</w:t>
+            </w:r>
+          </w:p>
+        </w:tc>
+        <w:tc>
+          <w:tcPr/>
+          <w:p>
+            <w:pPr>
+              <w:pStyle w:val="Compact"/>
+              <w:jc w:val="left"/>
+            </w:pPr>
+            <w:r>
+              <w:t xml:space="preserve">Code generated; value undefined (divide by zero); check not run, exit 3</w:t>
+            </w:r>
+          </w:p>
+        </w:tc>
+        <w:tc>
+          <w:tcPr/>
+          <w:p>
+            <w:pPr>
+              <w:pStyle w:val="Compact"/>
+              <w:jc w:val="left"/>
+            </w:pPr>
+            <w:r>
+              <w:t xml:space="preserve">A:</w:t>
+            </w:r>
+            <w:r>
+              <w:t xml:space="preserve"> </w:t>
+            </w:r>
+            <w:r>
+              <w:rPr>
+                <w:rStyle w:val="VerbatimChar"/>
+              </w:rPr>
+              <w:t xml:space="preserve">LOAD r0,[a]; LOAD r1,[b]; LOAD r2,[b]; SUB r3,r1,r2; DIV r4,r0,r3</w:t>
+            </w:r>
+            <w:r>
+              <w:t xml:space="preserve"> </w:t>
+            </w:r>
+            <w:r>
+              <w:t xml:space="preserve">(cost 7) check not run ; B:</w:t>
+            </w:r>
+            <w:r>
+              <w:t xml:space="preserve"> </w:t>
+            </w:r>
+            <w:r>
+              <w:rPr>
+                <w:rStyle w:val="VerbatimChar"/>
+              </w:rPr>
+              <w:t xml:space="preserve">PUSH [a]; PUSH [b]; SUBM [b]; DIV</w:t>
+            </w:r>
+            <w:r>
+              <w:t xml:space="preserve"> </w:t>
+            </w:r>
+            <w:r>
+              <w:t xml:space="preserve">(cost 6) check not run ; exit 3</w:t>
+            </w:r>
+          </w:p>
+        </w:tc>
+        <w:tc>
+          <w:tcPr/>
+          <w:p>
+            <w:pPr>
+              <w:pStyle w:val="Compact"/>
+              <w:jc w:val="center"/>
+            </w:pPr>
+            <w:r>
+              <w:t xml:space="preserve">PASS</w:t>
+            </w:r>
+          </w:p>
+        </w:tc>
+      </w:tr>
+      <w:tr>
+        <w:tc>
+          <w:tcPr/>
+          <w:p>
+            <w:pPr>
+              <w:pStyle w:val="Compact"/>
+              <w:jc w:val="left"/>
+            </w:pPr>
+            <w:r>
+              <w:rPr>
+                <w:rStyle w:val="VerbatimChar"/>
+              </w:rPr>
               <w:t xml:space="preserve">--suite</w:t>
             </w:r>
             <w:r>
@@ -11173,7 +11895,7 @@
               <w:jc w:val="left"/>
             </w:pPr>
             <w:r>
-              <w:t xml:space="preserve">10 review expressions</w:t>
+              <w:t xml:space="preserve">11 review expressions</w:t>
             </w:r>
           </w:p>
         </w:tc>
@@ -11197,7 +11919,7 @@
               <w:jc w:val="left"/>
             </w:pPr>
             <w:r>
-              <w:t xml:space="preserve">10/10 expressions passed</w:t>
+              <w:t xml:space="preserve">11/11 expressions passed</w:t>
             </w:r>
           </w:p>
         </w:tc>
@@ -11244,7 +11966,7 @@
               <w:jc w:val="left"/>
             </w:pPr>
             <w:r>
-              <w:t xml:space="preserve">3,333 trees x 2 targets</w:t>
+              <w:t xml:space="preserve">7,140 trees (6,846 checked) x 2 targets</w:t>
             </w:r>
           </w:p>
         </w:tc>
@@ -11268,7 +11990,7 @@
               <w:jc w:val="left"/>
             </w:pPr>
             <w:r>
-              <w:t xml:space="preserve">6666 target runs, 0 failures</w:t>
+              <w:t xml:space="preserve">13,692 target runs, 0 failures</w:t>
             </w:r>
           </w:p>
         </w:tc>
@@ -11999,6 +12721,101 @@
           </w:p>
         </w:tc>
       </w:tr>
+      <w:tr>
+        <w:tc>
+          <w:tcPr/>
+          <w:p>
+            <w:pPr>
+              <w:pStyle w:val="Compact"/>
+              <w:jc w:val="left"/>
+            </w:pPr>
+            <w:r>
+              <w:rPr>
+                <w:rStyle w:val="VerbatimChar"/>
+              </w:rPr>
+              <w:t xml:space="preserve">(a + b) / c</w:t>
+            </w:r>
+          </w:p>
+        </w:tc>
+        <w:tc>
+          <w:tcPr/>
+          <w:p>
+            <w:pPr>
+              <w:pStyle w:val="Compact"/>
+              <w:jc w:val="left"/>
+            </w:pPr>
+            <w:r>
+              <w:rPr>
+                <w:rStyle w:val="VerbatimChar"/>
+              </w:rPr>
+              <w:t xml:space="preserve">LOAD r0,[a]; LOAD r1,[b]; ADD r2,r0,r1; LOAD r3,[c]; DIV r4,r2,r3</w:t>
+            </w:r>
+          </w:p>
+        </w:tc>
+        <w:tc>
+          <w:tcPr/>
+          <w:p>
+            <w:pPr>
+              <w:pStyle w:val="Compact"/>
+              <w:jc w:val="center"/>
+            </w:pPr>
+            <w:r>
+              <w:t xml:space="preserve">7</w:t>
+            </w:r>
+          </w:p>
+        </w:tc>
+        <w:tc>
+          <w:tcPr/>
+          <w:p>
+            <w:pPr>
+              <w:pStyle w:val="Compact"/>
+              <w:jc w:val="left"/>
+            </w:pPr>
+            <w:r>
+              <w:rPr>
+                <w:rStyle w:val="VerbatimChar"/>
+              </w:rPr>
+              <w:t xml:space="preserve">PUSH [a]; ADDM [b]; DIVM [c]</w:t>
+            </w:r>
+          </w:p>
+        </w:tc>
+        <w:tc>
+          <w:tcPr/>
+          <w:p>
+            <w:pPr>
+              <w:pStyle w:val="Compact"/>
+              <w:jc w:val="center"/>
+            </w:pPr>
+            <w:r>
+              <w:t xml:space="preserve">5</w:t>
+            </w:r>
+          </w:p>
+        </w:tc>
+        <w:tc>
+          <w:tcPr/>
+          <w:p>
+            <w:pPr>
+              <w:pStyle w:val="Compact"/>
+              <w:jc w:val="center"/>
+            </w:pPr>
+            <w:r>
+              <w:t xml:space="preserve">1</w:t>
+            </w:r>
+          </w:p>
+        </w:tc>
+        <w:tc>
+          <w:tcPr/>
+          <w:p>
+            <w:pPr>
+              <w:pStyle w:val="Compact"/>
+              <w:jc w:val="center"/>
+            </w:pPr>
+            <w:r>
+              <w:t xml:space="preserve">A ✓ B ✓</w:t>
+            </w:r>
+          </w:p>
+        </w:tc>
+      </w:tr>
     </w:tbl>
     <w:p>
       <w:pPr>
@@ -13022,6 +13839,95 @@
           </w:p>
         </w:tc>
       </w:tr>
+      <w:tr>
+        <w:tc>
+          <w:tcPr/>
+          <w:p>
+            <w:pPr>
+              <w:pStyle w:val="Compact"/>
+              <w:jc w:val="left"/>
+            </w:pPr>
+            <w:r>
+              <w:t xml:space="preserve">11</w:t>
+            </w:r>
+          </w:p>
+        </w:tc>
+        <w:tc>
+          <w:tcPr/>
+          <w:p>
+            <w:pPr>
+              <w:pStyle w:val="Compact"/>
+              <w:jc w:val="left"/>
+            </w:pPr>
+            <w:r>
+              <w:rPr>
+                <w:rStyle w:val="VerbatimChar"/>
+              </w:rPr>
+              <w:t xml:space="preserve">(a + b) / c</w:t>
+            </w:r>
+          </w:p>
+        </w:tc>
+        <w:tc>
+          <w:tcPr/>
+          <w:p>
+            <w:pPr>
+              <w:pStyle w:val="Compact"/>
+              <w:jc w:val="center"/>
+            </w:pPr>
+            <w:r>
+              <w:t xml:space="preserve">5</w:t>
+            </w:r>
+          </w:p>
+        </w:tc>
+        <w:tc>
+          <w:tcPr/>
+          <w:p>
+            <w:pPr>
+              <w:pStyle w:val="Compact"/>
+              <w:jc w:val="center"/>
+            </w:pPr>
+            <w:r>
+              <w:t xml:space="preserve">7</w:t>
+            </w:r>
+          </w:p>
+        </w:tc>
+        <w:tc>
+          <w:tcPr/>
+          <w:p>
+            <w:pPr>
+              <w:pStyle w:val="Compact"/>
+              <w:jc w:val="center"/>
+            </w:pPr>
+            <w:r>
+              <w:t xml:space="preserve">3</w:t>
+            </w:r>
+          </w:p>
+        </w:tc>
+        <w:tc>
+          <w:tcPr/>
+          <w:p>
+            <w:pPr>
+              <w:pStyle w:val="Compact"/>
+              <w:jc w:val="center"/>
+            </w:pPr>
+            <w:r>
+              <w:t xml:space="preserve">5</w:t>
+            </w:r>
+          </w:p>
+        </w:tc>
+        <w:tc>
+          <w:tcPr/>
+          <w:p>
+            <w:pPr>
+              <w:pStyle w:val="Compact"/>
+              <w:jc w:val="center"/>
+            </w:pPr>
+            <w:r>
+              <w:t xml:space="preserve">PASS</w:t>
+            </w:r>
+          </w:p>
+        </w:tc>
+      </w:tr>
     </w:tbl>
     <w:p>
       <w:pPr>
@@ -13038,7 +13944,7 @@
           <w:b/>
           <w:bCs/>
         </w:rPr>
-        <w:t xml:space="preserve">10/10 expressions passed</w:t>
+        <w:t xml:space="preserve">11/11 expressions passed</w:t>
       </w:r>
       <w:r>
         <w:t xml:space="preserve"> </w:t>
@@ -13080,7 +13986,19 @@
         <w:t xml:space="preserve"> </w:t>
       </w:r>
       <w:r>
-        <w:t xml:space="preserve">builds every tree of depth ≤ 2 over the leaves {a, b, 3} with ADD, SUB, MUL and LOAD (3,333 trees) and runs each through both targets. The baseline is a naive selector that emits one instruction per IR node (LOAD/LOADI or PUSH/PUSHI for leaves, the plain operator for interior nodes) under the same cost model; it never uses immediate or memory operand forms.</w:t>
+        <w:t xml:space="preserve">builds every tree of depth ≤ 2 over the leaves {a, b, 3} with ADD, SUB, MUL, DIV and LOAD (7,140 trees). The 294 trees that divide by zero with the test values (such as</w:t>
+      </w:r>
+      <w:r>
+        <w:t xml:space="preserve"> </w:t>
+      </w:r>
+      <w:r>
+        <w:rPr>
+          <w:rStyle w:val="VerbatimChar"/>
+        </w:rPr>
+        <w:t xml:space="preserve">a / (b - b)</w:t>
+      </w:r>
+      <w:r>
+        <w:t xml:space="preserve">) have no reference value and are skipped; the other 6,846 run through both targets. The baseline is a naive selector that emits one instruction per IR node (LOAD/LOADI or PUSH/PUSHI for leaves, the plain operator for interior nodes) under the same cost model; it never uses immediate or memory operand forms.</w:t>
       </w:r>
     </w:p>
     <w:tbl>
@@ -13196,7 +14114,7 @@
               <w:jc w:val="center"/>
             </w:pPr>
             <w:r>
-              <w:t xml:space="preserve">7.26</w:t>
+              <w:t xml:space="preserve">8.49</w:t>
             </w:r>
           </w:p>
         </w:tc>
@@ -13270,7 +14188,7 @@
               <w:jc w:val="center"/>
             </w:pPr>
             <w:r>
-              <w:t xml:space="preserve">6.88</w:t>
+              <w:t xml:space="preserve">8.05</w:t>
             </w:r>
           </w:p>
         </w:tc>
@@ -13282,7 +14200,7 @@
               <w:jc w:val="center"/>
             </w:pPr>
             <w:r>
-              <w:t xml:space="preserve">5.2%</w:t>
+              <w:t xml:space="preserve">5.1%</w:t>
             </w:r>
           </w:p>
         </w:tc>
@@ -13294,7 +14212,7 @@
               <w:jc w:val="center"/>
             </w:pPr>
             <w:r>
-              <w:t xml:space="preserve">1146 of 3333 trees</w:t>
+              <w:t xml:space="preserve">2655 of 6846 trees</w:t>
             </w:r>
           </w:p>
         </w:tc>
@@ -13318,7 +14236,7 @@
               <w:jc w:val="center"/>
             </w:pPr>
             <w:r>
-              <w:t xml:space="preserve">10</w:t>
+              <w:t xml:space="preserve">13</w:t>
             </w:r>
           </w:p>
         </w:tc>
@@ -13344,7 +14262,7 @@
               <w:jc w:val="center"/>
             </w:pPr>
             <w:r>
-              <w:t xml:space="preserve">5.55</w:t>
+              <w:t xml:space="preserve">6.72</w:t>
             </w:r>
           </w:p>
         </w:tc>
@@ -13356,7 +14274,7 @@
               <w:jc w:val="center"/>
             </w:pPr>
             <w:r>
-              <w:t xml:space="preserve">23.6%</w:t>
+              <w:t xml:space="preserve">20.9%</w:t>
             </w:r>
           </w:p>
         </w:tc>
@@ -13368,7 +14286,7 @@
               <w:jc w:val="center"/>
             </w:pPr>
             <w:r>
-              <w:t xml:space="preserve">3267 of 3333 trees</w:t>
+              <w:t xml:space="preserve">6762 of 6846 trees</w:t>
             </w:r>
           </w:p>
         </w:tc>
@@ -13392,7 +14310,7 @@
               <w:jc w:val="center"/>
             </w:pPr>
             <w:r>
-              <w:t xml:space="preserve">8</w:t>
+              <w:t xml:space="preserve">11</w:t>
             </w:r>
           </w:p>
         </w:tc>
@@ -13403,7 +14321,7 @@
         <w:pStyle w:val="FirstParagraph"/>
       </w:pPr>
       <w:r>
-        <w:t xml:space="preserve">6666 target runs in total,, 0 failures (</w:t>
+        <w:t xml:space="preserve">13692 target runs in total,, 0 failures (</w:t>
       </w:r>
       <w:r>
         <w:rPr>
@@ -13430,7 +14348,7 @@
         <w:t xml:space="preserve"> </w:t>
       </w:r>
       <w:r>
-        <w:t xml:space="preserve">All 6,666 programs are correct. BURS never costs more than the naive baseline (the baseline cover is always available to the matcher) and is strictly cheaper wherever a special operand form applies. Target B benefits far more (23.6%) because whenever the right operand of a binary node is a variable or a constant,</w:t>
+        <w:t xml:space="preserve">All 13,692 programs are correct. BURS never costs more than the naive baseline (the baseline cover is always available to the matcher) and is strictly cheaper wherever a special operand form applies. Target B benefits far more (20.9%) because whenever the right operand of a binary node is a variable or a constant,</w:t>
       </w:r>
       <w:r>
         <w:t xml:space="preserve"> </w:t>
@@ -13457,6 +14375,15 @@
         <w:rPr>
           <w:rStyle w:val="VerbatimChar"/>
         </w:rPr>
+        <w:t xml:space="preserve">DIVM</w:t>
+      </w:r>
+      <w:r>
+        <w:t xml:space="preserve">/</w:t>
+      </w:r>
+      <w:r>
+        <w:rPr>
+          <w:rStyle w:val="VerbatimChar"/>
+        </w:rPr>
         <w:t xml:space="preserve">ADDI</w:t>
       </w:r>
       <w:r>
@@ -13478,7 +14405,7 @@
         <w:t xml:space="preserve"> </w:t>
       </w:r>
       <w:r>
-        <w:t xml:space="preserve">disappears; this applies to 3,267 of the 3,333 trees. Target A only gains when a constant appears on the right of ADD or SUB, since it has no memory-operand arithmetic and no commutative rules (</w:t>
+        <w:t xml:space="preserve">disappears; this applies to 6,762 of the 6,846 trees. Target A only gains when a constant appears on the right of ADD, SUB or DIV, since it has no memory-operand arithmetic and no commutative rules (</w:t>
       </w:r>
       <w:r>
         <w:rPr>
@@ -13695,7 +14622,7 @@
               <w:jc w:val="right"/>
             </w:pPr>
             <w:r>
-              <w:t xml:space="preserve">443</w:t>
+              <w:t xml:space="preserve">551</w:t>
             </w:r>
           </w:p>
         </w:tc>
@@ -13707,7 +14634,7 @@
               <w:jc w:val="right"/>
             </w:pPr>
             <w:r>
-              <w:t xml:space="preserve">0.004</w:t>
+              <w:t xml:space="preserve">0.005</w:t>
             </w:r>
           </w:p>
         </w:tc>
@@ -13719,7 +14646,7 @@
               <w:jc w:val="right"/>
             </w:pPr>
             <w:r>
-              <w:t xml:space="preserve">9.9</w:t>
+              <w:t xml:space="preserve">12.3</w:t>
             </w:r>
           </w:p>
         </w:tc>
@@ -13731,7 +14658,7 @@
               <w:jc w:val="right"/>
             </w:pPr>
             <w:r>
-              <w:t xml:space="preserve">374</w:t>
+              <w:t xml:space="preserve">478</w:t>
             </w:r>
           </w:p>
         </w:tc>
@@ -13769,7 +14696,7 @@
               <w:jc w:val="right"/>
             </w:pPr>
             <w:r>
-              <w:t xml:space="preserve">0.015</w:t>
+              <w:t xml:space="preserve">0.018</w:t>
             </w:r>
           </w:p>
         </w:tc>
@@ -13781,7 +14708,7 @@
               <w:jc w:val="right"/>
             </w:pPr>
             <w:r>
-              <w:t xml:space="preserve">9.5</w:t>
+              <w:t xml:space="preserve">11.3</w:t>
             </w:r>
           </w:p>
         </w:tc>
@@ -13793,7 +14720,7 @@
               <w:jc w:val="right"/>
             </w:pPr>
             <w:r>
-              <w:t xml:space="preserve">1758</w:t>
+              <w:t xml:space="preserve">2168</w:t>
             </w:r>
           </w:p>
         </w:tc>
@@ -13805,7 +14732,7 @@
               <w:jc w:val="right"/>
             </w:pPr>
             <w:r>
-              <w:t xml:space="preserve">0.019</w:t>
+              <w:t xml:space="preserve">0.021</w:t>
             </w:r>
           </w:p>
         </w:tc>
@@ -13817,7 +14744,7 @@
               <w:jc w:val="right"/>
             </w:pPr>
             <w:r>
-              <w:t xml:space="preserve">12.0</w:t>
+              <w:t xml:space="preserve">13.2</w:t>
             </w:r>
           </w:p>
         </w:tc>
@@ -13829,7 +14756,7 @@
               <w:jc w:val="right"/>
             </w:pPr>
             <w:r>
-              <w:t xml:space="preserve">1491</w:t>
+              <w:t xml:space="preserve">1900</w:t>
             </w:r>
           </w:p>
         </w:tc>
@@ -13867,7 +14794,7 @@
               <w:jc w:val="right"/>
             </w:pPr>
             <w:r>
-              <w:t xml:space="preserve">0.056</w:t>
+              <w:t xml:space="preserve">0.071</w:t>
             </w:r>
           </w:p>
         </w:tc>
@@ -13879,7 +14806,7 @@
               <w:jc w:val="right"/>
             </w:pPr>
             <w:r>
-              <w:t xml:space="preserve">11.2</w:t>
+              <w:t xml:space="preserve">14.2</w:t>
             </w:r>
           </w:p>
         </w:tc>
@@ -13891,7 +14818,7 @@
               <w:jc w:val="right"/>
             </w:pPr>
             <w:r>
-              <w:t xml:space="preserve">5476</w:t>
+              <w:t xml:space="preserve">6765</w:t>
             </w:r>
           </w:p>
         </w:tc>
@@ -13903,7 +14830,7 @@
               <w:jc w:val="right"/>
             </w:pPr>
             <w:r>
-              <w:t xml:space="preserve">0.075</w:t>
+              <w:t xml:space="preserve">0.096</w:t>
             </w:r>
           </w:p>
         </w:tc>
@@ -13915,7 +14842,7 @@
               <w:jc w:val="right"/>
             </w:pPr>
             <w:r>
-              <w:t xml:space="preserve">15.0</w:t>
+              <w:t xml:space="preserve">19.3</w:t>
             </w:r>
           </w:p>
         </w:tc>
@@ -13927,7 +14854,7 @@
               <w:jc w:val="right"/>
             </w:pPr>
             <w:r>
-              <w:t xml:space="preserve">4652</w:t>
+              <w:t xml:space="preserve">5953</w:t>
             </w:r>
           </w:p>
         </w:tc>
@@ -13965,7 +14892,7 @@
               <w:jc w:val="right"/>
             </w:pPr>
             <w:r>
-              <w:t xml:space="preserve">0.172</w:t>
+              <w:t xml:space="preserve">0.200</w:t>
             </w:r>
           </w:p>
         </w:tc>
@@ -13977,7 +14904,7 @@
               <w:jc w:val="right"/>
             </w:pPr>
             <w:r>
-              <w:t xml:space="preserve">13.0</w:t>
+              <w:t xml:space="preserve">15.1</w:t>
             </w:r>
           </w:p>
         </w:tc>
@@ -13989,7 +14916,7 @@
               <w:jc w:val="right"/>
             </w:pPr>
             <w:r>
-              <w:t xml:space="preserve">14563</w:t>
+              <w:t xml:space="preserve">17940</w:t>
             </w:r>
           </w:p>
         </w:tc>
@@ -14001,7 +14928,7 @@
               <w:jc w:val="right"/>
             </w:pPr>
             <w:r>
-              <w:t xml:space="preserve">0.207</w:t>
+              <w:t xml:space="preserve">0.232</w:t>
             </w:r>
           </w:p>
         </w:tc>
@@ -14013,7 +14940,7 @@
               <w:jc w:val="right"/>
             </w:pPr>
             <w:r>
-              <w:t xml:space="preserve">15.6</w:t>
+              <w:t xml:space="preserve">17.5</w:t>
             </w:r>
           </w:p>
         </w:tc>
@@ -14025,7 +14952,7 @@
               <w:jc w:val="right"/>
             </w:pPr>
             <w:r>
-              <w:t xml:space="preserve">12340</w:t>
+              <w:t xml:space="preserve">15735</w:t>
             </w:r>
           </w:p>
         </w:tc>
@@ -14063,7 +14990,7 @@
               <w:jc w:val="right"/>
             </w:pPr>
             <w:r>
-              <w:t xml:space="preserve">0.800</w:t>
+              <w:t xml:space="preserve">0.893</w:t>
             </w:r>
           </w:p>
         </w:tc>
@@ -14075,7 +15002,7 @@
               <w:jc w:val="right"/>
             </w:pPr>
             <w:r>
-              <w:t xml:space="preserve">13.4</w:t>
+              <w:t xml:space="preserve">14.9</w:t>
             </w:r>
           </w:p>
         </w:tc>
@@ -14087,7 +15014,7 @@
               <w:jc w:val="right"/>
             </w:pPr>
             <w:r>
-              <w:t xml:space="preserve">66085</w:t>
+              <w:t xml:space="preserve">80804</w:t>
             </w:r>
           </w:p>
         </w:tc>
@@ -14099,7 +15026,7 @@
               <w:jc w:val="right"/>
             </w:pPr>
             <w:r>
-              <w:t xml:space="preserve">0.963</w:t>
+              <w:t xml:space="preserve">1.081</w:t>
             </w:r>
           </w:p>
         </w:tc>
@@ -14111,7 +15038,7 @@
               <w:jc w:val="right"/>
             </w:pPr>
             <w:r>
-              <w:t xml:space="preserve">16.1</w:t>
+              <w:t xml:space="preserve">18.1</w:t>
             </w:r>
           </w:p>
         </w:tc>
@@ -14123,7 +15050,7 @@
               <w:jc w:val="right"/>
             </w:pPr>
             <w:r>
-              <w:t xml:space="preserve">56059</w:t>
+              <w:t xml:space="preserve">70894</w:t>
             </w:r>
           </w:p>
         </w:tc>
@@ -14161,7 +15088,7 @@
               <w:jc w:val="right"/>
             </w:pPr>
             <w:r>
-              <w:t xml:space="preserve">3.533</w:t>
+              <w:t xml:space="preserve">4.152</w:t>
             </w:r>
           </w:p>
         </w:tc>
@@ -14173,7 +15100,7 @@
               <w:jc w:val="right"/>
             </w:pPr>
             <w:r>
-              <w:t xml:space="preserve">14.7</w:t>
+              <w:t xml:space="preserve">17.3</w:t>
             </w:r>
           </w:p>
         </w:tc>
@@ -14185,7 +15112,7 @@
               <w:jc w:val="right"/>
             </w:pPr>
             <w:r>
-              <w:t xml:space="preserve">265182</w:t>
+              <w:t xml:space="preserve">323609</w:t>
             </w:r>
           </w:p>
         </w:tc>
@@ -14197,7 +15124,7 @@
               <w:jc w:val="right"/>
             </w:pPr>
             <w:r>
-              <w:t xml:space="preserve">4.073</w:t>
+              <w:t xml:space="preserve">5.058</w:t>
             </w:r>
           </w:p>
         </w:tc>
@@ -14209,7 +15136,7 @@
               <w:jc w:val="right"/>
             </w:pPr>
             <w:r>
-              <w:t xml:space="preserve">17.0</w:t>
+              <w:t xml:space="preserve">21.1</w:t>
             </w:r>
           </w:p>
         </w:tc>
@@ -14221,7 +15148,7 @@
               <w:jc w:val="right"/>
             </w:pPr>
             <w:r>
-              <w:t xml:space="preserve">224498</w:t>
+              <w:t xml:space="preserve">283646</w:t>
             </w:r>
           </w:p>
         </w:tc>
@@ -14265,7 +15192,7 @@
         <w:t xml:space="preserve"> </w:t>
       </w:r>
       <w:r>
-        <w:t xml:space="preserve">Time per node stays within roughly 10–20 ns while the tree grows by a factor of more than 500, i.e. labeling is linear in tree size as predicted in Section 7.5. The mild growth in ns/node comes from cache misses on larger trees, not from the algorithm. Even a 240,000-node expression is labeled in under 5 ms.</w:t>
+        <w:t xml:space="preserve">Time per node stays within roughly 9–21 ns while the tree grows by a factor of more than 500, i.e. labeling is linear in tree size as predicted in Section 7.5. The mild growth in ns/node comes from cache misses on larger trees, not from the algorithm. Even a 240,000-node expression is labeled in about 5 ms.</w:t>
       </w:r>
     </w:p>
     <w:p>
@@ -14296,9 +15223,9 @@
         <w:tblLook w:firstRow="1" w:lastRow="0" w:firstColumn="0" w:lastColumn="0" w:noHBand="0" w:noVBand="0" w:val="0020"/>
       </w:tblPr>
       <w:tblGrid>
-        <w:gridCol w:w="3017"/>
+        <w:gridCol w:w="2866"/>
         <w:gridCol w:w="1131"/>
-        <w:gridCol w:w="3017"/>
+        <w:gridCol w:w="3168"/>
         <w:gridCol w:w="754"/>
       </w:tblGrid>
       <w:tr>
@@ -14455,79 +15382,147 @@
               <w:rPr>
                 <w:rStyle w:val="VerbatimChar"/>
               </w:rPr>
+              <w:t xml:space="preserve">%</w:t>
+            </w:r>
+            <w:r>
+              <w:t xml:space="preserve">,</w:t>
+            </w:r>
+            <w:r>
+              <w:t xml:space="preserve"> </w:t>
+            </w:r>
+            <w:r>
+              <w:rPr>
+                <w:rStyle w:val="VerbatimChar"/>
+              </w:rPr>
+              <w:t xml:space="preserve">^</w:t>
+            </w:r>
+            <w:r>
+              <w:t xml:space="preserve">,</w:t>
+            </w:r>
+            <w:r>
+              <w:t xml:space="preserve"> </w:t>
+            </w:r>
+            <w:r>
+              <w:rPr>
+                <w:rStyle w:val="VerbatimChar"/>
+              </w:rPr>
+              <w:t xml:space="preserve">&amp;</w:t>
+            </w:r>
+            <w:r>
+              <w:t xml:space="preserve">, bitwise or) or unary minus</w:t>
+            </w:r>
+          </w:p>
+        </w:tc>
+        <w:tc>
+          <w:tcPr/>
+          <w:p>
+            <w:pPr>
+              <w:pStyle w:val="Compact"/>
+              <w:jc w:val="left"/>
+            </w:pPr>
+            <w:r>
+              <w:t xml:space="preserve">Parser</w:t>
+            </w:r>
+          </w:p>
+        </w:tc>
+        <w:tc>
+          <w:tcPr/>
+          <w:p>
+            <w:pPr>
+              <w:pStyle w:val="Compact"/>
+              <w:jc w:val="left"/>
+            </w:pPr>
+            <w:r>
+              <w:t xml:space="preserve">Message names the operator and the supported set, or suggests</w:t>
+            </w:r>
+            <w:r>
+              <w:t xml:space="preserve"> </w:t>
+            </w:r>
+            <w:r>
+              <w:rPr>
+                <w:rStyle w:val="VerbatimChar"/>
+              </w:rPr>
+              <w:t xml:space="preserve">(0 - x)</w:t>
+            </w:r>
+          </w:p>
+        </w:tc>
+        <w:tc>
+          <w:tcPr/>
+          <w:p>
+            <w:pPr>
+              <w:pStyle w:val="Compact"/>
+              <w:jc w:val="center"/>
+            </w:pPr>
+            <w:r>
+              <w:t xml:space="preserve">2</w:t>
+            </w:r>
+          </w:p>
+        </w:tc>
+      </w:tr>
+      <w:tr>
+        <w:tc>
+          <w:tcPr/>
+          <w:p>
+            <w:pPr>
+              <w:pStyle w:val="Compact"/>
+              <w:jc w:val="left"/>
+            </w:pPr>
+            <w:r>
+              <w:t xml:space="preserve">Division by zero with the current test values</w:t>
+            </w:r>
+          </w:p>
+        </w:tc>
+        <w:tc>
+          <w:tcPr/>
+          <w:p>
+            <w:pPr>
+              <w:pStyle w:val="Compact"/>
+              <w:jc w:val="left"/>
+            </w:pPr>
+            <w:r>
+              <w:rPr>
+                <w:rStyle w:val="VerbatimChar"/>
+              </w:rPr>
+              <w:t xml:space="preserve">ir_eval()</w:t>
+            </w:r>
+            <w:r>
+              <w:t xml:space="preserve"> </w:t>
+            </w:r>
+            <w:r>
               <w:t xml:space="preserve">/</w:t>
             </w:r>
             <w:r>
-              <w:t xml:space="preserve">,</w:t>
-            </w:r>
-            <w:r>
-              <w:t xml:space="preserve"> </w:t>
-            </w:r>
-            <w:r>
-              <w:rPr>
-                <w:rStyle w:val="VerbatimChar"/>
-              </w:rPr>
-              <w:t xml:space="preserve">%</w:t>
-            </w:r>
-            <w:r>
-              <w:t xml:space="preserve">,</w:t>
-            </w:r>
-            <w:r>
-              <w:t xml:space="preserve"> </w:t>
-            </w:r>
-            <w:r>
-              <w:rPr>
-                <w:rStyle w:val="VerbatimChar"/>
-              </w:rPr>
-              <w:t xml:space="preserve">^</w:t>
-            </w:r>
-            <w:r>
-              <w:t xml:space="preserve">,</w:t>
-            </w:r>
-            <w:r>
-              <w:t xml:space="preserve"> </w:t>
-            </w:r>
-            <w:r>
-              <w:rPr>
-                <w:rStyle w:val="VerbatimChar"/>
-              </w:rPr>
-              <w:t xml:space="preserve">&amp;</w:t>
-            </w:r>
-            <w:r>
-              <w:t xml:space="preserve">, bitwise or) or unary minus</w:t>
-            </w:r>
-          </w:p>
-        </w:tc>
-        <w:tc>
-          <w:tcPr/>
-          <w:p>
-            <w:pPr>
-              <w:pStyle w:val="Compact"/>
-              <w:jc w:val="left"/>
-            </w:pPr>
-            <w:r>
-              <w:t xml:space="preserve">Parser</w:t>
-            </w:r>
-          </w:p>
-        </w:tc>
-        <w:tc>
-          <w:tcPr/>
-          <w:p>
-            <w:pPr>
-              <w:pStyle w:val="Compact"/>
-              <w:jc w:val="left"/>
-            </w:pPr>
-            <w:r>
-              <w:t xml:space="preserve">Message names the operator and the supported set, or suggests</w:t>
-            </w:r>
-            <w:r>
-              <w:t xml:space="preserve"> </w:t>
-            </w:r>
-            <w:r>
-              <w:rPr>
-                <w:rStyle w:val="VerbatimChar"/>
-              </w:rPr>
-              <w:t xml:space="preserve">(0 - x)</w:t>
+              <w:t xml:space="preserve"> </w:t>
+            </w:r>
+            <w:r>
+              <w:rPr>
+                <w:rStyle w:val="VerbatimChar"/>
+              </w:rPr>
+              <w:t xml:space="preserve">ir_div()</w:t>
+            </w:r>
+          </w:p>
+        </w:tc>
+        <w:tc>
+          <w:tcPr/>
+          <w:p>
+            <w:pPr>
+              <w:pStyle w:val="Compact"/>
+              <w:jc w:val="left"/>
+            </w:pPr>
+            <w:r>
+              <w:t xml:space="preserve">Code is generated; reference shown as undefined; simulation not run (change values with</w:t>
+            </w:r>
+            <w:r>
+              <w:t xml:space="preserve"> </w:t>
+            </w:r>
+            <w:r>
+              <w:rPr>
+                <w:rStyle w:val="VerbatimChar"/>
+              </w:rPr>
+              <w:t xml:space="preserve">-D</w:t>
+            </w:r>
+            <w:r>
+              <w:t xml:space="preserve">)</w:t>
             </w:r>
           </w:p>
         </w:tc>
@@ -14539,7 +15534,7 @@
               <w:jc w:val="center"/>
             </w:pPr>
             <w:r>
-              <w:t xml:space="preserve">2</w:t>
+              <w:t xml:space="preserve">3</w:t>
             </w:r>
           </w:p>
         </w:tc>
@@ -14849,9 +15844,9 @@
         <w:tblLook w:firstRow="1" w:lastRow="0" w:firstColumn="0" w:lastColumn="0" w:noHBand="0" w:noVBand="0" w:val="0020"/>
       </w:tblPr>
       <w:tblGrid>
-        <w:gridCol w:w="2153"/>
-        <w:gridCol w:w="3383"/>
-        <w:gridCol w:w="2383"/>
+        <w:gridCol w:w="2132"/>
+        <w:gridCol w:w="3274"/>
+        <w:gridCol w:w="2513"/>
       </w:tblGrid>
       <w:tr>
         <w:trPr>
@@ -15183,7 +16178,7 @@
               <w:jc w:val="left"/>
             </w:pPr>
             <w:r>
-              <w:t xml:space="preserve">No division, unary minus, comparisons</w:t>
+              <w:t xml:space="preserve">No remainder, unary minus, comparisons</w:t>
             </w:r>
           </w:p>
         </w:tc>
@@ -15207,7 +16202,7 @@
               <w:jc w:val="left"/>
             </w:pPr>
             <w:r>
-              <w:t xml:space="preserve">Add IR operators and rules</w:t>
+              <w:t xml:space="preserve">Add IR operators and rules (as was done for DIV)</w:t>
             </w:r>
           </w:p>
         </w:tc>
@@ -15270,10 +16265,10 @@
       </w:tblPr>
       <w:tblGrid>
         <w:gridCol w:w="377"/>
-        <w:gridCol w:w="3545"/>
+        <w:gridCol w:w="3394"/>
         <w:gridCol w:w="754"/>
         <w:gridCol w:w="829"/>
-        <w:gridCol w:w="2413"/>
+        <w:gridCol w:w="2564"/>
       </w:tblGrid>
       <w:tr>
         <w:trPr>
@@ -15843,6 +16838,80 @@
             </w:pPr>
             <w:r>
               <w:t xml:space="preserve">Fixed – per-target failure counts printed</w:t>
+            </w:r>
+          </w:p>
+        </w:tc>
+      </w:tr>
+      <w:tr>
+        <w:tc>
+          <w:tcPr/>
+          <w:p>
+            <w:pPr>
+              <w:pStyle w:val="Compact"/>
+              <w:jc w:val="left"/>
+            </w:pPr>
+            <w:r>
+              <w:t xml:space="preserve">D7</w:t>
+            </w:r>
+          </w:p>
+        </w:tc>
+        <w:tc>
+          <w:tcPr/>
+          <w:p>
+            <w:pPr>
+              <w:pStyle w:val="Compact"/>
+              <w:jc w:val="left"/>
+            </w:pPr>
+            <w:r>
+              <w:t xml:space="preserve">Division was rejected (</w:t>
+            </w:r>
+            <w:r>
+              <w:rPr>
+                <w:rStyle w:val="VerbatimChar"/>
+              </w:rPr>
+              <w:t xml:space="preserve">a / b</w:t>
+            </w:r>
+            <w:r>
+              <w:t xml:space="preserve"> </w:t>
+            </w:r>
+            <w:r>
+              <w:t xml:space="preserve">→ exit 2); requested during preparation</w:t>
+            </w:r>
+          </w:p>
+        </w:tc>
+        <w:tc>
+          <w:tcPr/>
+          <w:p>
+            <w:pPr>
+              <w:pStyle w:val="Compact"/>
+              <w:jc w:val="left"/>
+            </w:pPr>
+            <w:r>
+              <w:t xml:space="preserve">IR / targets</w:t>
+            </w:r>
+          </w:p>
+        </w:tc>
+        <w:tc>
+          <w:tcPr/>
+          <w:p>
+            <w:pPr>
+              <w:pStyle w:val="Compact"/>
+              <w:jc w:val="left"/>
+            </w:pPr>
+            <w:r>
+              <w:t xml:space="preserve">Med</w:t>
+            </w:r>
+          </w:p>
+        </w:tc>
+        <w:tc>
+          <w:tcPr/>
+          <w:p>
+            <w:pPr>
+              <w:pStyle w:val="Compact"/>
+              <w:jc w:val="left"/>
+            </w:pPr>
+            <w:r>
+              <w:t xml:space="preserve">Fixed – DIV added to IR, parser, both grammars and simulators; 6 new tests</w:t>
             </w:r>
           </w:p>
         </w:tc>
@@ -16159,7 +17228,7 @@
               <w:jc w:val="left"/>
             </w:pPr>
             <w:r>
-              <w:t xml:space="preserve">9-rule</w:t>
+              <w:t xml:space="preserve">11-rule</w:t>
             </w:r>
             <w:r>
               <w:t xml:space="preserve"> </w:t>
@@ -16174,7 +17243,7 @@
               <w:t xml:space="preserve"> </w:t>
             </w:r>
             <w:r>
-              <w:t xml:space="preserve">and 14-rule</w:t>
+              <w:t xml:space="preserve">and 17-rule</w:t>
             </w:r>
             <w:r>
               <w:t xml:space="preserve"> </w:t>
@@ -16619,7 +17688,7 @@
               <w:t xml:space="preserve"> </w:t>
             </w:r>
             <w:r>
-              <w:t xml:space="preserve">(27/27),</w:t>
+              <w:t xml:space="preserve">(33/33),</w:t>
             </w:r>
             <w:r>
               <w:t xml:space="preserve"> </w:t>
@@ -16821,7 +17890,7 @@
               <w:rPr>
                 <w:rStyle w:val="VerbatimChar"/>
               </w:rPr>
-              <w:t xml:space="preserve">./build/burs "a / b"</w:t>
+              <w:t xml:space="preserve">./build/burs "a % b"</w:t>
             </w:r>
           </w:p>
         </w:tc>
@@ -17124,7 +18193,7 @@
         <w:t xml:space="preserve">make &amp;&amp; make test</w:t>
       </w:r>
       <w:r>
-        <w:t xml:space="preserve">, passes 27/27 checks including 6,666 exhaustive runs, lowers code cost by 5.2% (A) and 23.6% (B) against a naive selector, and labels in linear time.</w:t>
+        <w:t xml:space="preserve">, passes 33/33 checks including 13,692 exhaustive runs, lowers code cost by 5.1% (A) and 20.9% (B) against a naive selector, and labels in linear time. Adding division later required one IR operator and one rule group per grammar, with no change to the engine, which is the retargetability claim in practice.</w:t>
       </w:r>
     </w:p>
     <w:p>
@@ -17595,7 +18664,7 @@
         <w:rPr>
           <w:rStyle w:val="VerbatimChar"/>
         </w:rPr>
-        <w:t xml:space="preserve">make test                 # 27 passed, 0 failed</w:t>
+        <w:t xml:space="preserve">make test                 # 33 passed, 0 failed</w:t>
       </w:r>
     </w:p>
     <w:tbl>
@@ -17869,7 +18938,7 @@
               <w:jc w:val="left"/>
             </w:pPr>
             <w:r>
-              <w:t xml:space="preserve">All 3,333 trees of depth ≤ 2 on both targets, with baseline comparison</w:t>
+              <w:t xml:space="preserve">All 7,140 trees of depth ≤ 2 on both targets, with baseline comparison</w:t>
             </w:r>
           </w:p>
         </w:tc>
@@ -18004,10 +19073,13 @@
         <w:rPr>
           <w:rStyle w:val="VerbatimChar"/>
         </w:rPr>
-        <w:t xml:space="preserve">+ - *</w:t>
-      </w:r>
-      <w:r>
-        <w:t xml:space="preserve">, non-negative integer constants, identifiers, parentheses, and memory loads</w:t>
+        <w:t xml:space="preserve">+ - * /</w:t>
+      </w:r>
+      <w:r>
+        <w:t xml:space="preserve"> </w:t>
+      </w:r>
+      <w:r>
+        <w:t xml:space="preserve">(division truncates toward zero), non-negative integer constants, identifiers, parentheses, and memory loads</w:t>
       </w:r>
       <w:r>
         <w:t xml:space="preserve"> </w:t>
@@ -18190,7 +19262,7 @@
         <w:rPr>
           <w:rStyle w:val="VerbatimChar"/>
         </w:rPr>
-        <w:t xml:space="preserve">Target A : 3-address load/store register machine (LOAD/LOADI/ADD/ADDI/SUB/SUBI/MUL)</w:t>
+        <w:t xml:space="preserve">Target A : 3-address load/store register machine (LOAD/LOADI/ADD/ADDI/SUB/SUBI/MUL/DIV/DIVI)</w:t>
       </w:r>
       <w:r>
         <w:br/>
@@ -18352,7 +19424,7 @@
         <w:rPr>
           <w:rStyle w:val="VerbatimChar"/>
         </w:rPr>
-        <w:t xml:space="preserve">Target B : zero-address stack machine (PUSH/PUSHI/LOAD/ADD/ADDM/ADDI/SUB.../MUL...)</w:t>
+        <w:t xml:space="preserve">Target B : zero-address stack machine (PUSH/PUSHI/LOAD/ADD/ADDM/ADDI/SUB.../MUL.../DIV...)</w:t>
       </w:r>
       <w:r>
         <w:br/>
@@ -18696,7 +19768,7 @@
         <w:rPr>
           <w:rStyle w:val="VerbatimChar"/>
         </w:rPr>
-        <w:t xml:space="preserve">Target A : 3-address load/store register machine (LOAD/LOADI/ADD/ADDI/SUB/SUBI/MUL)</w:t>
+        <w:t xml:space="preserve">Target A : 3-address load/store register machine (LOAD/LOADI/ADD/ADDI/SUB/SUBI/MUL/DIV/DIVI)</w:t>
       </w:r>
       <w:r>
         <w:br/>
@@ -18912,7 +19984,7 @@
         <w:rPr>
           <w:rStyle w:val="VerbatimChar"/>
         </w:rPr>
-        <w:t xml:space="preserve">%term CONST=1 VAR=2 ADD=3 SUB=4 MUL=5 LOAD=6</w:t>
+        <w:t xml:space="preserve">%term CONST=1 VAR=2 ADD=3 SUB=4 MUL=5 LOAD=6 DIV=7</w:t>
       </w:r>
       <w:r>
         <w:t xml:space="preserve">. Each rule reads</w:t>
@@ -19049,6 +20121,24 @@
         </w:rPr>
         <w:t xml:space="preserve">reg:    MUL(reg,reg)    = 9 (2);</w:t>
       </w:r>
+      <w:r>
+        <w:br/>
+      </w:r>
+      <w:r>
+        <w:rPr>
+          <w:rStyle w:val="VerbatimChar"/>
+        </w:rPr>
+        <w:t xml:space="preserve">reg:    DIV(reg,reg)    = 10 (3);</w:t>
+      </w:r>
+      <w:r>
+        <w:br/>
+      </w:r>
+      <w:r>
+        <w:rPr>
+          <w:rStyle w:val="VerbatimChar"/>
+        </w:rPr>
+        <w:t xml:space="preserve">reg:    DIV(reg,imm)    = 11 (3);</w:t>
+      </w:r>
     </w:p>
     <w:p>
       <w:pPr>
@@ -19213,6 +20303,33 @@
         </w:rPr>
         <w:t xml:space="preserve">stk:    MUL(stk,imm)    = 14 (2);</w:t>
       </w:r>
+      <w:r>
+        <w:br/>
+      </w:r>
+      <w:r>
+        <w:rPr>
+          <w:rStyle w:val="VerbatimChar"/>
+        </w:rPr>
+        <w:t xml:space="preserve">stk:    DIV(stk,stk)    = 15 (3);</w:t>
+      </w:r>
+      <w:r>
+        <w:br/>
+      </w:r>
+      <w:r>
+        <w:rPr>
+          <w:rStyle w:val="VerbatimChar"/>
+        </w:rPr>
+        <w:t xml:space="preserve">stk:    DIV(stk,mem)    = 16 (3);</w:t>
+      </w:r>
+      <w:r>
+        <w:br/>
+      </w:r>
+      <w:r>
+        <w:rPr>
+          <w:rStyle w:val="VerbatimChar"/>
+        </w:rPr>
+        <w:t xml:space="preserve">stk:    DIV(stk,imm)    = 17 (3);</w:t>
+      </w:r>
     </w:p>
     <w:p>
       <w:pPr>
@@ -19242,7 +20359,7 @@
         <w:rPr>
           <w:rStyle w:val="VerbatimChar"/>
         </w:rPr>
-        <w:t xml:space="preserve">Target A: 3-address load/store register machine (LOAD/LOADI/ADD/ADDI/SUB/SUBI/MUL)</w:t>
+        <w:t xml:space="preserve">Target A: 3-address load/store register machine (LOAD/LOADI/ADD/ADDI/SUB/SUBI/MUL/DIV/DIVI)</w:t>
       </w:r>
       <w:r>
         <w:br/>
@@ -19347,18 +20464,36 @@
         <w:br/>
       </w:r>
       <w:r>
+        <w:rPr>
+          <w:rStyle w:val="VerbatimChar"/>
+        </w:rPr>
+        <w:t xml:space="preserve">    10  reg: DIV(reg,reg)           3 DIV   rd, ra, rb</w:t>
+      </w:r>
+      <w:r>
         <w:br/>
       </w:r>
       <w:r>
         <w:rPr>
           <w:rStyle w:val="VerbatimChar"/>
         </w:rPr>
-        <w:t xml:space="preserve">Target B: zero-address stack machine (PUSH/PUSHI/LOAD/ADD/ADDM/ADDI/SUB.../MUL...)</w:t>
+        <w:t xml:space="preserve">    11  reg: DIV(reg,imm)           3 DIVI  rd, ra, #k</w:t>
       </w:r>
       <w:r>
         <w:br/>
       </w:r>
       <w:r>
+        <w:br/>
+      </w:r>
+      <w:r>
+        <w:rPr>
+          <w:rStyle w:val="VerbatimChar"/>
+        </w:rPr>
+        <w:t xml:space="preserve">Target B: zero-address stack machine (PUSH/PUSHI/LOAD/ADD/ADDM/ADDI/SUB.../MUL.../DIV...)</w:t>
+      </w:r>
+      <w:r>
+        <w:br/>
+      </w:r>
+      <w:r>
         <w:rPr>
           <w:rStyle w:val="VerbatimChar"/>
         </w:rPr>
@@ -19499,10 +20634,32 @@
         </w:rPr>
         <w:t xml:space="preserve">    14  stk: MUL(stk,imm)           2 MULI  #k</w:t>
       </w:r>
-    </w:p>
-    <w:p>
-      <w:r>
-        <w:br w:type="page"/>
+      <w:r>
+        <w:br/>
+      </w:r>
+      <w:r>
+        <w:rPr>
+          <w:rStyle w:val="VerbatimChar"/>
+        </w:rPr>
+        <w:t xml:space="preserve">    15  stk: DIV(stk,stk)           3 DIV</w:t>
+      </w:r>
+      <w:r>
+        <w:br/>
+      </w:r>
+      <w:r>
+        <w:rPr>
+          <w:rStyle w:val="VerbatimChar"/>
+        </w:rPr>
+        <w:t xml:space="preserve">    16  stk: DIV(stk,mem)           3 DIVM  [var]</w:t>
+      </w:r>
+      <w:r>
+        <w:br/>
+      </w:r>
+      <w:r>
+        <w:rPr>
+          <w:rStyle w:val="VerbatimChar"/>
+        </w:rPr>
+        <w:t xml:space="preserve">    17  stk: DIV(stk,imm)           3 DIVI  #k</w:t>
       </w:r>
     </w:p>
     <w:p>
@@ -19840,7 +20997,7 @@
               <w:rPr>
                 <w:rStyle w:val="VerbatimChar"/>
               </w:rPr>
-              <w:t xml:space="preserve">./build/burs "a / b"</w:t>
+              <w:t xml:space="preserve">./build/burs "a % b"</w:t>
             </w:r>
           </w:p>
         </w:tc>
@@ -19994,7 +21151,7 @@
               <w:jc w:val="left"/>
             </w:pPr>
             <w:r>
-              <w:t xml:space="preserve">27 passed; 0 failures; 5.2% / 23.6% savings; linear time</w:t>
+              <w:t xml:space="preserve">33 passed; 0 failures; 5.1% / 20.9% savings; linear time</w:t>
             </w:r>
           </w:p>
         </w:tc>
@@ -20914,19 +22071,19 @@
               <w:t xml:space="preserve"> </w:t>
             </w:r>
             <w:r>
-              <w:t xml:space="preserve">builds without warnings and reports 27 passed, 0 failed</w:t>
-            </w:r>
-          </w:p>
-        </w:tc>
-        <w:tc>
-          <w:tcPr/>
-          <w:p>
-            <w:pPr>
-              <w:pStyle w:val="Compact"/>
-              <w:jc w:val="left"/>
-            </w:pPr>
-            <w:r>
-              <w:t xml:space="preserve">Pre-check on team laptop (Apple M1, macOS 26.6, clang 21): 27 passed, 0 failed</w:t>
+              <w:t xml:space="preserve">builds without warnings and reports 33 passed, 0 failed</w:t>
+            </w:r>
+          </w:p>
+        </w:tc>
+        <w:tc>
+          <w:tcPr/>
+          <w:p>
+            <w:pPr>
+              <w:pStyle w:val="Compact"/>
+              <w:jc w:val="left"/>
+            </w:pPr>
+            <w:r>
+              <w:t xml:space="preserve">Pre-check on team laptop (Apple M1, macOS 26.6, clang 21): 33 passed, 0 failed</w:t>
             </w:r>
           </w:p>
         </w:tc>

</xml_diff>